<commit_message>
M-DOCS-CLEANUP-A1: audit-doc methodology-sync register + AAI §11 reframe
Deliverable 1: append M-DOCS-CLEANUP-A1 methodology-sync register to the
audit doc (4 sync rows — M-CH4-A1, M-ATTRIB-A2, M-DIAG-A4 v2.0,
M-GHG-REDESIGN-A1 — mirroring the M-TREND-A1 register pattern; v1.7 footer).

Deliverable 2: append additive §11 attributability-framing reframe to the
AAI↔FIRMS validation; docx re-exported (figures embedded).

Documentation only — no engine/constants/seed/test changes. Suite unchanged
(1957 passed, 31 skipped). Row 4 cites IC v4 §2.2a/§2.3 (the
M-GHG-REDESIGN-A1 closed-entry doc does not yet exist).

Co-Authored-By: Claude Opus 4.8 (1M context) <noreply@anthropic.com>
</commit_message>
<xml_diff>
--- a/docs/aai_firms_validation.docx
+++ b/docs/aai_firms_validation.docx
@@ -2,7 +2,7 @@
 <file path=word/document.xml><?xml version="1.0" encoding="utf-8"?>
 <w:document xmlns:w="http://schemas.openxmlformats.org/wordprocessingml/2006/main" xmlns:m="http://schemas.openxmlformats.org/officeDocument/2006/math" xmlns:r="http://schemas.openxmlformats.org/officeDocument/2006/relationships" xmlns:o="urn:schemas-microsoft-com:office:office" xmlns:v="urn:schemas-microsoft-com:vml" xmlns:w10="urn:schemas-microsoft-com:office:word" xmlns:a="http://schemas.openxmlformats.org/drawingml/2006/main" xmlns:pic="http://schemas.openxmlformats.org/drawingml/2006/picture" xmlns:wp="http://schemas.openxmlformats.org/drawingml/2006/wordprocessingDrawing">
   <w:body>
-    <w:bookmarkStart w:id="32" w:name="aai-firms-dust-catalog-event-validation"/>
+    <w:bookmarkStart w:id="34" w:name="aai-firms-dust-catalog-event-validation"/>
     <w:p>
       <w:pPr>
         <w:pStyle w:val="Heading1"/>
@@ -5257,8 +5257,1247 @@
         <w:t xml:space="preserve">(Step F).</w:t>
       </w:r>
     </w:p>
+    <w:p>
+      <w:r>
+        <w:pict>
+          <v:rect style="width:0;height:1.5pt" o:hralign="center" o:hrstd="t" o:hr="t"/>
+        </w:pict>
+      </w:r>
+    </w:p>
     <w:bookmarkEnd w:id="31"/>
+    <w:bookmarkStart w:id="32" w:name="X884e5efc17f5135776a7e9d9a321d613b834dd4"/>
+    <w:p>
+      <w:pPr>
+        <w:pStyle w:val="Heading2"/>
+      </w:pPr>
+      <w:r>
+        <w:t xml:space="preserve">§10 — Post-M-DIAG-A4 re-run findings (31 May 2026)</w:t>
+      </w:r>
+    </w:p>
+    <w:p>
+      <w:pPr>
+        <w:pStyle w:val="FirstParagraph"/>
+      </w:pPr>
+      <w:r>
+        <w:t xml:space="preserve">Following M-DIAG-A4’s denominator fix (climatology baseline replacing the spatial std of the time-averaged ring), AAI behaviour was re-checked against the</w:t>
+      </w:r>
+      <w:r>
+        <w:t xml:space="preserve"> </w:t>
+      </w:r>
+      <w:r>
+        <w:rPr>
+          <w:b/>
+          <w:bCs/>
+        </w:rPr>
+        <w:t xml:space="preserve">post-fix engine</w:t>
+      </w:r>
+      <w:r>
+        <w:t xml:space="preserve"> </w:t>
+      </w:r>
+      <w:r>
+        <w:t xml:space="preserve">at a re-selected clean control and a strong event. The check runs the production code path (</w:t>
+      </w:r>
+      <w:r>
+        <w:rPr>
+          <w:rStyle w:val="VerbatimChar"/>
+        </w:rPr>
+        <w:t xml:space="preserve">engine.air.compute_pollutant_snapshot</w:t>
+      </w:r>
+      <w:r>
+        <w:t xml:space="preserve"> </w:t>
+      </w:r>
+      <w:r>
+        <w:t xml:space="preserve">→</w:t>
+      </w:r>
+      <w:r>
+        <w:t xml:space="preserve"> </w:t>
+      </w:r>
+      <w:r>
+        <w:rPr>
+          <w:rStyle w:val="VerbatimChar"/>
+        </w:rPr>
+        <w:t xml:space="preserve">six_step</w:t>
+      </w:r>
+      <w:r>
+        <w:t xml:space="preserve">); the harness is</w:t>
+      </w:r>
+      <w:r>
+        <w:t xml:space="preserve"> </w:t>
+      </w:r>
+      <w:r>
+        <w:rPr>
+          <w:rStyle w:val="VerbatimChar"/>
+        </w:rPr>
+        <w:t xml:space="preserve">analysis/m_diag_a4_validation_probe.py</w:t>
+      </w:r>
+      <w:r>
+        <w:t xml:space="preserve"> </w:t>
+      </w:r>
+      <w:r>
+        <w:t xml:space="preserve">and the raw output is</w:t>
+      </w:r>
+      <w:r>
+        <w:t xml:space="preserve"> </w:t>
+      </w:r>
+      <w:r>
+        <w:rPr>
+          <w:rStyle w:val="VerbatimChar"/>
+        </w:rPr>
+        <w:t xml:space="preserve">analysis/m_diag_a4_validation_probe.json</w:t>
+      </w:r>
+      <w:r>
+        <w:t xml:space="preserve">.</w:t>
+      </w:r>
+    </w:p>
+    <w:p>
+      <w:pPr>
+        <w:pStyle w:val="BodyText"/>
+      </w:pPr>
+      <w:r>
+        <w:rPr>
+          <w:b/>
+          <w:bCs/>
+        </w:rPr>
+        <w:t xml:space="preserve">Numerical findings (the fix’s operative win — interpretable scale, not zero firing).</w:t>
+      </w:r>
+    </w:p>
+    <w:tbl>
+      <w:tblPr>
+        <w:tblStyle w:val="Table"/>
+        <w:tblW w:type="pct" w:w="5000"/>
+        <w:tblLayout w:type="fixed"/>
+        <w:tblLook w:firstRow="1" w:lastRow="0" w:firstColumn="0" w:lastColumn="0" w:noHBand="0" w:noVBand="0" w:val="0020"/>
+      </w:tblPr>
+      <w:tblGrid>
+        <w:gridCol w:w="1320"/>
+        <w:gridCol w:w="1320"/>
+        <w:gridCol w:w="1320"/>
+        <w:gridCol w:w="1320"/>
+        <w:gridCol w:w="1320"/>
+        <w:gridCol w:w="1320"/>
+      </w:tblGrid>
+      <w:tr>
+        <w:trPr>
+          <w:tblHeader w:val="on"/>
+        </w:trPr>
+        <w:tc>
+          <w:tcPr/>
+          <w:p>
+            <w:pPr>
+              <w:pStyle w:val="Compact"/>
+            </w:pPr>
+            <w:r>
+              <w:t xml:space="preserve">Case</w:t>
+            </w:r>
+          </w:p>
+        </w:tc>
+        <w:tc>
+          <w:tcPr/>
+          <w:p>
+            <w:pPr>
+              <w:pStyle w:val="Compact"/>
+            </w:pPr>
+            <w:r>
+              <w:t xml:space="preserve">indicator</w:t>
+            </w:r>
+          </w:p>
+        </w:tc>
+        <w:tc>
+          <w:tcPr/>
+          <w:p>
+            <w:pPr>
+              <w:pStyle w:val="Compact"/>
+              <w:jc w:val="right"/>
+            </w:pPr>
+            <w:r>
+              <w:rPr>
+                <w:rStyle w:val="VerbatimChar"/>
+              </w:rPr>
+              <w:t xml:space="preserve">bg_std</w:t>
+            </w:r>
+            <w:r>
+              <w:t xml:space="preserve"> </w:t>
+            </w:r>
+            <w:r>
+              <w:t xml:space="preserve">spatial (old)</w:t>
+            </w:r>
+          </w:p>
+        </w:tc>
+        <w:tc>
+          <w:tcPr/>
+          <w:p>
+            <w:pPr>
+              <w:pStyle w:val="Compact"/>
+              <w:jc w:val="right"/>
+            </w:pPr>
+            <w:r>
+              <w:rPr>
+                <w:rStyle w:val="VerbatimChar"/>
+              </w:rPr>
+              <w:t xml:space="preserve">bg_std</w:t>
+            </w:r>
+            <w:r>
+              <w:t xml:space="preserve"> </w:t>
+            </w:r>
+            <w:r>
+              <w:t xml:space="preserve">temporal (new)</w:t>
+            </w:r>
+          </w:p>
+        </w:tc>
+        <w:tc>
+          <w:tcPr/>
+          <w:p>
+            <w:pPr>
+              <w:pStyle w:val="Compact"/>
+              <w:jc w:val="right"/>
+            </w:pPr>
+            <w:r>
+              <w:t xml:space="preserve">ratio (temporal/spatial)</w:t>
+            </w:r>
+          </w:p>
+        </w:tc>
+        <w:tc>
+          <w:tcPr/>
+          <w:p>
+            <w:pPr>
+              <w:pStyle w:val="Compact"/>
+              <w:jc w:val="right"/>
+            </w:pPr>
+            <w:r>
+              <w:t xml:space="preserve">per-day</w:t>
+            </w:r>
+            <w:r>
+              <w:t xml:space="preserve"> </w:t>
+            </w:r>
+            <w:r>
+              <w:rPr>
+                <w:rStyle w:val="VerbatimChar"/>
+              </w:rPr>
+              <w:t xml:space="preserve">hf</w:t>
+            </w:r>
+          </w:p>
+        </w:tc>
+      </w:tr>
+      <w:tr>
+        <w:tc>
+          <w:tcPr/>
+          <w:p>
+            <w:pPr>
+              <w:pStyle w:val="Compact"/>
+            </w:pPr>
+            <w:r>
+              <w:t xml:space="preserve">Patagonia control (clean)</w:t>
+            </w:r>
+          </w:p>
+        </w:tc>
+        <w:tc>
+          <w:tcPr/>
+          <w:p>
+            <w:pPr>
+              <w:pStyle w:val="Compact"/>
+            </w:pPr>
+            <w:r>
+              <w:t xml:space="preserve">AAI</w:t>
+            </w:r>
+          </w:p>
+        </w:tc>
+        <w:tc>
+          <w:tcPr/>
+          <w:p>
+            <w:pPr>
+              <w:pStyle w:val="Compact"/>
+              <w:jc w:val="right"/>
+            </w:pPr>
+            <w:r>
+              <w:t xml:space="preserve">0.054</w:t>
+            </w:r>
+          </w:p>
+        </w:tc>
+        <w:tc>
+          <w:tcPr/>
+          <w:p>
+            <w:pPr>
+              <w:pStyle w:val="Compact"/>
+              <w:jc w:val="right"/>
+            </w:pPr>
+            <w:r>
+              <w:t xml:space="preserve">0.518</w:t>
+            </w:r>
+          </w:p>
+        </w:tc>
+        <w:tc>
+          <w:tcPr/>
+          <w:p>
+            <w:pPr>
+              <w:pStyle w:val="Compact"/>
+              <w:jc w:val="right"/>
+            </w:pPr>
+            <w:r>
+              <w:rPr>
+                <w:b/>
+                <w:bCs/>
+              </w:rPr>
+              <w:t xml:space="preserve">9.7×</w:t>
+            </w:r>
+          </w:p>
+        </w:tc>
+        <w:tc>
+          <w:tcPr/>
+          <w:p>
+            <w:pPr>
+              <w:pStyle w:val="Compact"/>
+              <w:jc w:val="right"/>
+            </w:pPr>
+            <w:r>
+              <w:t xml:space="preserve">0.02</w:t>
+            </w:r>
+          </w:p>
+        </w:tc>
+      </w:tr>
+      <w:tr>
+        <w:tc>
+          <w:tcPr/>
+          <w:p>
+            <w:pPr>
+              <w:pStyle w:val="Compact"/>
+            </w:pPr>
+            <w:r>
+              <w:t xml:space="preserve">Patagonia control (clean)</w:t>
+            </w:r>
+          </w:p>
+        </w:tc>
+        <w:tc>
+          <w:tcPr/>
+          <w:p>
+            <w:pPr>
+              <w:pStyle w:val="Compact"/>
+            </w:pPr>
+            <w:r>
+              <w:t xml:space="preserve">O3</w:t>
+            </w:r>
+          </w:p>
+        </w:tc>
+        <w:tc>
+          <w:tcPr/>
+          <w:p>
+            <w:pPr>
+              <w:pStyle w:val="Compact"/>
+              <w:jc w:val="right"/>
+            </w:pPr>
+            <w:r>
+              <w:t xml:space="preserve">0.501</w:t>
+            </w:r>
+          </w:p>
+        </w:tc>
+        <w:tc>
+          <w:tcPr/>
+          <w:p>
+            <w:pPr>
+              <w:pStyle w:val="Compact"/>
+              <w:jc w:val="right"/>
+            </w:pPr>
+            <w:r>
+              <w:t xml:space="preserve">22.92</w:t>
+            </w:r>
+          </w:p>
+        </w:tc>
+        <w:tc>
+          <w:tcPr/>
+          <w:p>
+            <w:pPr>
+              <w:pStyle w:val="Compact"/>
+              <w:jc w:val="right"/>
+            </w:pPr>
+            <w:r>
+              <w:t xml:space="preserve">45.7×</w:t>
+            </w:r>
+          </w:p>
+        </w:tc>
+        <w:tc>
+          <w:tcPr/>
+          <w:p>
+            <w:pPr>
+              <w:pStyle w:val="Compact"/>
+              <w:jc w:val="right"/>
+            </w:pPr>
+            <w:r>
+              <w:t xml:space="preserve">0.09</w:t>
+            </w:r>
+          </w:p>
+        </w:tc>
+      </w:tr>
+      <w:tr>
+        <w:tc>
+          <w:tcPr/>
+          <w:p>
+            <w:pPr>
+              <w:pStyle w:val="Compact"/>
+            </w:pPr>
+            <w:r>
+              <w:t xml:space="preserve">Quebec 2023 wildfire (event)</w:t>
+            </w:r>
+          </w:p>
+        </w:tc>
+        <w:tc>
+          <w:tcPr/>
+          <w:p>
+            <w:pPr>
+              <w:pStyle w:val="Compact"/>
+            </w:pPr>
+            <w:r>
+              <w:t xml:space="preserve">AAI</w:t>
+            </w:r>
+          </w:p>
+        </w:tc>
+        <w:tc>
+          <w:tcPr/>
+          <w:p>
+            <w:pPr>
+              <w:pStyle w:val="Compact"/>
+              <w:jc w:val="right"/>
+            </w:pPr>
+            <w:r>
+              <w:t xml:space="preserve">0.094</w:t>
+            </w:r>
+          </w:p>
+        </w:tc>
+        <w:tc>
+          <w:tcPr/>
+          <w:p>
+            <w:pPr>
+              <w:pStyle w:val="Compact"/>
+              <w:jc w:val="right"/>
+            </w:pPr>
+            <w:r>
+              <w:t xml:space="preserve">0.405</w:t>
+            </w:r>
+          </w:p>
+        </w:tc>
+        <w:tc>
+          <w:tcPr/>
+          <w:p>
+            <w:pPr>
+              <w:pStyle w:val="Compact"/>
+              <w:jc w:val="right"/>
+            </w:pPr>
+            <w:r>
+              <w:t xml:space="preserve">4.3×</w:t>
+            </w:r>
+          </w:p>
+        </w:tc>
+        <w:tc>
+          <w:tcPr/>
+          <w:p>
+            <w:pPr>
+              <w:pStyle w:val="Compact"/>
+              <w:jc w:val="right"/>
+            </w:pPr>
+            <w:r>
+              <w:t xml:space="preserve">0.18</w:t>
+            </w:r>
+          </w:p>
+        </w:tc>
+      </w:tr>
+    </w:tbl>
+    <w:p>
+      <w:pPr>
+        <w:pStyle w:val="Compact"/>
+        <w:numPr>
+          <w:ilvl w:val="0"/>
+          <w:numId w:val="1007"/>
+        </w:numPr>
+      </w:pPr>
+      <w:r>
+        <w:t xml:space="preserve">The spatial denominator at the clean AAI control (0.054) sits exactly in the §4 collapse range (0.04–0.27); the temporal denominator (0.518) sits in the §4 site-temporal-std range (0.35–0.57). The</w:t>
+      </w:r>
+      <w:r>
+        <w:t xml:space="preserve"> </w:t>
+      </w:r>
+      <w:r>
+        <w:rPr>
+          <w:b/>
+          <w:bCs/>
+        </w:rPr>
+        <w:t xml:space="preserve">9.7× ratio</w:t>
+      </w:r>
+      <w:r>
+        <w:t xml:space="preserve"> </w:t>
+      </w:r>
+      <w:r>
+        <w:t xml:space="preserve">is the §4 inflation factor made concrete — pre-fix per-day z was inflated ~10×, the mechanism behind magnitude artefacts like the Beijing control’s per-day z of 31.6.</w:t>
+      </w:r>
+    </w:p>
+    <w:p>
+      <w:pPr>
+        <w:pStyle w:val="Compact"/>
+        <w:numPr>
+          <w:ilvl w:val="0"/>
+          <w:numId w:val="1007"/>
+        </w:numPr>
+      </w:pPr>
+      <w:r>
+        <w:t xml:space="preserve">Post-fix, the clean control’s per-day hot-fraction is</w:t>
+      </w:r>
+      <w:r>
+        <w:t xml:space="preserve"> </w:t>
+      </w:r>
+      <w:r>
+        <w:rPr>
+          <w:b/>
+          <w:bCs/>
+        </w:rPr>
+        <w:t xml:space="preserve">0.02</w:t>
+      </w:r>
+      <w:r>
+        <w:t xml:space="preserve"> </w:t>
+      </w:r>
+      <w:r>
+        <w:t xml:space="preserve">— down from the pre-fix median control hf of 0.33 (§5). The event/control hf separation is now ~8× (0.18 vs 0.02), where pre-fix the denominator collapse left some clean controls firing</w:t>
+      </w:r>
+      <w:r>
+        <w:t xml:space="preserve"> </w:t>
+      </w:r>
+      <w:r>
+        <w:rPr>
+          <w:i/>
+          <w:iCs/>
+        </w:rPr>
+        <w:t xml:space="preserve">above</w:t>
+      </w:r>
+      <w:r>
+        <w:t xml:space="preserve"> </w:t>
+      </w:r>
+      <w:r>
+        <w:t xml:space="preserve">this event’s rate.</w:t>
+      </w:r>
+    </w:p>
+    <w:p>
+      <w:pPr>
+        <w:pStyle w:val="Compact"/>
+        <w:numPr>
+          <w:ilvl w:val="0"/>
+          <w:numId w:val="1007"/>
+        </w:numPr>
+      </w:pPr>
+      <w:r>
+        <w:t xml:space="preserve">The same correction holds for O3 (45.7×), confirming the §5/D2 generic-collapse finding: the fix is not AAI-specific.</w:t>
+      </w:r>
+    </w:p>
+    <w:p>
+      <w:pPr>
+        <w:pStyle w:val="FirstParagraph"/>
+      </w:pPr>
+      <w:r>
+        <w:rPr>
+          <w:b/>
+          <w:bCs/>
+        </w:rPr>
+        <w:t xml:space="preserve">Methodological note.</w:t>
+      </w:r>
+      <w:r>
+        <w:t xml:space="preserve"> </w:t>
+      </w:r>
+      <w:r>
+        <w:t xml:space="preserve">The v1.0 framing of</w:t>
+      </w:r>
+      <w:r>
+        <w:t xml:space="preserve"> </w:t>
+      </w:r>
+      <w:r>
+        <w:t xml:space="preserve">“5/5 false-positive rate at clean controls”</w:t>
+      </w:r>
+      <w:r>
+        <w:t xml:space="preserve"> </w:t>
+      </w:r>
+      <w:r>
+        <w:t xml:space="preserve">was partly a control-selection artefact (3/5 of the original controls contained transient absorbing-aerosol days, per §7 and the M-DIAG-A3 §7 caveat) and partly a framing artefact under the tool’s supplier-attributability framing. The fix corrects a real numerical scale error in the per-day z denominator; the post-fix detector produces interpretable z-values. Event-detection performance changes are real but should</w:t>
+      </w:r>
+      <w:r>
+        <w:t xml:space="preserve"> </w:t>
+      </w:r>
+      <w:r>
+        <w:rPr>
+          <w:b/>
+          <w:bCs/>
+        </w:rPr>
+        <w:t xml:space="preserve">not</w:t>
+      </w:r>
+      <w:r>
+        <w:t xml:space="preserve"> </w:t>
+      </w:r>
+      <w:r>
+        <w:t xml:space="preserve">be read as the fix’s primary justification — see the M-DIAG-A3 addendum for the framing discussion.</w:t>
+      </w:r>
+    </w:p>
+    <w:p>
+      <w:pPr>
+        <w:pStyle w:val="BodyText"/>
+      </w:pPr>
+      <w:r>
+        <w:rPr>
+          <w:b/>
+          <w:bCs/>
+        </w:rPr>
+        <w:t xml:space="preserve">Residual caveat.</w:t>
+      </w:r>
+      <w:r>
+        <w:t xml:space="preserve"> </w:t>
+      </w:r>
+      <w:r>
+        <w:t xml:space="preserve">M-DIAG-A4 keeps</w:t>
+      </w:r>
+      <w:r>
+        <w:t xml:space="preserve"> </w:t>
+      </w:r>
+      <w:r>
+        <w:rPr>
+          <w:rStyle w:val="VerbatimChar"/>
+        </w:rPr>
+        <w:t xml:space="preserve">bg_median</w:t>
+      </w:r>
+      <w:r>
+        <w:t xml:space="preserve"> </w:t>
+      </w:r>
+      <w:r>
+        <w:t xml:space="preserve">as the spatial median of the ring (the</w:t>
+      </w:r>
+      <w:r>
+        <w:t xml:space="preserve"> </w:t>
+      </w:r>
+      <w:r>
+        <w:t xml:space="preserve">“anomalous vs surroundings”</w:t>
+      </w:r>
+      <w:r>
+        <w:t xml:space="preserve"> </w:t>
+      </w:r>
+      <w:r>
+        <w:t xml:space="preserve">reference); only the denominator becomes temporal. So during a</w:t>
+      </w:r>
+      <w:r>
+        <w:t xml:space="preserve"> </w:t>
+      </w:r>
+      <w:r>
+        <w:rPr>
+          <w:b/>
+          <w:bCs/>
+        </w:rPr>
+        <w:t xml:space="preserve">regionally-uniform</w:t>
+      </w:r>
+      <w:r>
+        <w:t xml:space="preserve"> </w:t>
+      </w:r>
+      <w:r>
+        <w:t xml:space="preserve">event (the whole ring is smoky, e.g. Quebec) the site is genuinely not anomalous</w:t>
+      </w:r>
+      <w:r>
+        <w:t xml:space="preserve"> </w:t>
+      </w:r>
+      <w:r>
+        <w:rPr>
+          <w:i/>
+          <w:iCs/>
+        </w:rPr>
+        <w:t xml:space="preserve">against its surroundings</w:t>
+      </w:r>
+      <w:r>
+        <w:t xml:space="preserve"> </w:t>
+      </w:r>
+      <w:r>
+        <w:t xml:space="preserve">and the aggregate z stays low by design — the per-day detector still surfaces the elevated days (event hf 0.18 ≫ control 0.02). This is the intended attributability behaviour, not a regression; chronic/regional elevation is the trend view’s job (M-TREND-A1/A2), not the per-day screening detector’s.</w:t>
+      </w:r>
+    </w:p>
+    <w:p>
+      <w:pPr>
+        <w:pStyle w:val="BodyText"/>
+      </w:pPr>
+      <w:r>
+        <w:rPr>
+          <w:i/>
+          <w:iCs/>
+        </w:rPr>
+        <w:t xml:space="preserve">Re-run deliverables:</w:t>
+      </w:r>
+      <w:r>
+        <w:rPr>
+          <w:i/>
+          <w:iCs/>
+        </w:rPr>
+        <w:t xml:space="preserve"> </w:t>
+      </w:r>
+      <w:r>
+        <w:rPr>
+          <w:rStyle w:val="VerbatimChar"/>
+          <w:i/>
+          <w:iCs/>
+        </w:rPr>
+        <w:t xml:space="preserve">analysis/m_diag_a4_validation_probe.py</w:t>
+      </w:r>
+      <w:r>
+        <w:rPr>
+          <w:i/>
+          <w:iCs/>
+        </w:rPr>
+        <w:t xml:space="preserve"> </w:t>
+      </w:r>
+      <w:r>
+        <w:rPr>
+          <w:i/>
+          <w:iCs/>
+        </w:rPr>
+        <w:t xml:space="preserve">+</w:t>
+      </w:r>
+      <w:r>
+        <w:rPr>
+          <w:i/>
+          <w:iCs/>
+        </w:rPr>
+        <w:t xml:space="preserve"> </w:t>
+      </w:r>
+      <w:r>
+        <w:rPr>
+          <w:rStyle w:val="VerbatimChar"/>
+          <w:i/>
+          <w:iCs/>
+        </w:rPr>
+        <w:t xml:space="preserve">.json</w:t>
+      </w:r>
+      <w:r>
+        <w:rPr>
+          <w:i/>
+          <w:iCs/>
+        </w:rPr>
+        <w:t xml:space="preserve">. Word re-export at</w:t>
+      </w:r>
+      <w:r>
+        <w:rPr>
+          <w:i/>
+          <w:iCs/>
+        </w:rPr>
+        <w:t xml:space="preserve"> </w:t>
+      </w:r>
+      <w:r>
+        <w:rPr>
+          <w:rStyle w:val="VerbatimChar"/>
+          <w:i/>
+          <w:iCs/>
+        </w:rPr>
+        <w:t xml:space="preserve">docs/aai_firms_validation.docx</w:t>
+      </w:r>
+      <w:r>
+        <w:rPr>
+          <w:i/>
+          <w:iCs/>
+        </w:rPr>
+        <w:t xml:space="preserve"> </w:t>
+      </w:r>
+      <w:r>
+        <w:rPr>
+          <w:i/>
+          <w:iCs/>
+        </w:rPr>
+        <w:t xml:space="preserve">pending (Step D5).</w:t>
+      </w:r>
+    </w:p>
+    <w:p>
+      <w:r>
+        <w:pict>
+          <v:rect style="width:0;height:1.5pt" o:hralign="center" o:hrstd="t" o:hr="t"/>
+        </w:pict>
+      </w:r>
+    </w:p>
     <w:bookmarkEnd w:id="32"/>
+    <w:bookmarkStart w:id="33" w:name="X1153cd7d93bcd7e1cfbf032f66c0d390cd82db4"/>
+    <w:p>
+      <w:pPr>
+        <w:pStyle w:val="Heading2"/>
+      </w:pPr>
+      <w:r>
+        <w:t xml:space="preserve">§11 — Methodological reframe under attributability framing (M-DOCS-CLEANUP-A1, 31 May 2026)</w:t>
+      </w:r>
+    </w:p>
+    <w:p>
+      <w:pPr>
+        <w:pStyle w:val="FirstParagraph"/>
+      </w:pPr>
+      <w:r>
+        <w:t xml:space="preserve">Following the methodology consolidation across 30–31 May 2026 (M-CH4-A1, M-DIAG-A4 v2.0, M-ATTRIB-A2, M-GHG-REDESIGN-A1) and the establishment of the canonical supplier-attributability framing in</w:t>
+      </w:r>
+      <w:r>
+        <w:t xml:space="preserve"> </w:t>
+      </w:r>
+      <w:r>
+        <w:rPr>
+          <w:rStyle w:val="VerbatimChar"/>
+        </w:rPr>
+        <w:t xml:space="preserve">Indicators_Computation_v4.md</w:t>
+      </w:r>
+      <w:r>
+        <w:t xml:space="preserve"> </w:t>
+      </w:r>
+      <w:r>
+        <w:t xml:space="preserve">§0.7, this validation’s findings can be reread. This addendum is</w:t>
+      </w:r>
+      <w:r>
+        <w:t xml:space="preserve"> </w:t>
+      </w:r>
+      <w:r>
+        <w:rPr>
+          <w:b/>
+          <w:bCs/>
+        </w:rPr>
+        <w:t xml:space="preserve">additive</w:t>
+      </w:r>
+      <w:r>
+        <w:t xml:space="preserve"> </w:t>
+      </w:r>
+      <w:r>
+        <w:t xml:space="preserve">— it mirrors the M-DIAG-A3 diagnosis-report addendum pattern. The original report body (§1–§10) stands unchanged as a record of what the spatial-std denominator produced; the reinterpretation lives here. §10 already covers the numerical reframe under the climatology baseline; this section completes the reread by reframing the original</w:t>
+      </w:r>
+      <w:r>
+        <w:t xml:space="preserve"> </w:t>
+      </w:r>
+      <w:r>
+        <w:t xml:space="preserve">“5/5 false-positive”</w:t>
+      </w:r>
+      <w:r>
+        <w:t xml:space="preserve"> </w:t>
+      </w:r>
+      <w:r>
+        <w:t xml:space="preserve">headline narrative itself.</w:t>
+      </w:r>
+    </w:p>
+    <w:p>
+      <w:pPr>
+        <w:pStyle w:val="BodyText"/>
+      </w:pPr>
+      <w:r>
+        <w:t xml:space="preserve">The original headline of</w:t>
+      </w:r>
+      <w:r>
+        <w:t xml:space="preserve"> </w:t>
+      </w:r>
+      <w:r>
+        <w:t xml:space="preserve">“5/5 false-positive rate at clean controls”</w:t>
+      </w:r>
+      <w:r>
+        <w:t xml:space="preserve"> </w:t>
+      </w:r>
+      <w:r>
+        <w:t xml:space="preserve">(§5) was over-broad. It conflated two distinct issues:</w:t>
+      </w:r>
+    </w:p>
+    <w:p>
+      <w:pPr>
+        <w:numPr>
+          <w:ilvl w:val="0"/>
+          <w:numId w:val="1008"/>
+        </w:numPr>
+      </w:pPr>
+      <w:r>
+        <w:rPr>
+          <w:b/>
+          <w:bCs/>
+        </w:rPr>
+        <w:t xml:space="preserve">Control selection.</w:t>
+      </w:r>
+      <w:r>
+        <w:t xml:space="preserve"> </w:t>
+      </w:r>
+      <w:r>
+        <w:t xml:space="preserve">As §7’s caveat and the M-DIAG-A3 §7 caveat both acknowledge, 3 of the 5 original</w:t>
+      </w:r>
+      <w:r>
+        <w:t xml:space="preserve"> </w:t>
+      </w:r>
+      <w:r>
+        <w:t xml:space="preserve">“clean”</w:t>
+      </w:r>
+      <w:r>
+        <w:t xml:space="preserve"> </w:t>
+      </w:r>
+      <w:r>
+        <w:t xml:space="preserve">control windows contained transient absorbing-aerosol days. The detector was correctly firing on real events that the control selection had mislabelled as clean. M-DIAG-A4’s Phase 2 re-selected controls (Patagonia, Amazon wet season, NZ South Island, Appalachia, retained Puerto Rico) addressed this.</w:t>
+      </w:r>
+    </w:p>
+    <w:p>
+      <w:pPr>
+        <w:numPr>
+          <w:ilvl w:val="0"/>
+          <w:numId w:val="1008"/>
+        </w:numPr>
+      </w:pPr>
+      <w:r>
+        <w:rPr>
+          <w:b/>
+          <w:bCs/>
+        </w:rPr>
+        <w:t xml:space="preserve">Framing.</w:t>
+      </w:r>
+      <w:r>
+        <w:t xml:space="preserve"> </w:t>
+      </w:r>
+      <w:r>
+        <w:t xml:space="preserve">Under the supplier-attributability framing established in M-ATTRIB-A2 and codified in</w:t>
+      </w:r>
+      <w:r>
+        <w:t xml:space="preserve"> </w:t>
+      </w:r>
+      <w:r>
+        <w:rPr>
+          <w:rStyle w:val="VerbatimChar"/>
+        </w:rPr>
+        <w:t xml:space="preserve">Indicators_Computation_v4.md</w:t>
+      </w:r>
+      <w:r>
+        <w:t xml:space="preserve"> </w:t>
+      </w:r>
+      <w:r>
+        <w:t xml:space="preserve">§0.7, severity measures a supplier-attributable anomaly against regional context —</w:t>
+      </w:r>
+      <w:r>
+        <w:t xml:space="preserve"> </w:t>
+      </w:r>
+      <w:r>
+        <w:rPr>
+          <w:b/>
+          <w:bCs/>
+        </w:rPr>
+        <w:t xml:space="preserve">not</w:t>
+      </w:r>
+      <w:r>
+        <w:t xml:space="preserve"> </w:t>
+      </w:r>
+      <w:r>
+        <w:t xml:space="preserve">regional absolute pollution. A site firing per-day hot days at a</w:t>
+      </w:r>
+      <w:r>
+        <w:t xml:space="preserve"> </w:t>
+      </w:r>
+      <w:r>
+        <w:t xml:space="preserve">“clean”</w:t>
+      </w:r>
+      <w:r>
+        <w:t xml:space="preserve"> </w:t>
+      </w:r>
+      <w:r>
+        <w:t xml:space="preserve">control window is not intrinsically wrong if there was genuine local contrast that day. The control’s</w:t>
+      </w:r>
+      <w:r>
+        <w:t xml:space="preserve"> </w:t>
+      </w:r>
+      <w:r>
+        <w:rPr>
+          <w:i/>
+          <w:iCs/>
+        </w:rPr>
+        <w:t xml:space="preserve">regional</w:t>
+      </w:r>
+      <w:r>
+        <w:t xml:space="preserve"> </w:t>
+      </w:r>
+      <w:r>
+        <w:t xml:space="preserve">context being clean does not preclude site-specific anomalies; the detector flagging them is correct attributability behaviour.</w:t>
+      </w:r>
+    </w:p>
+    <w:p>
+      <w:pPr>
+        <w:pStyle w:val="FirstParagraph"/>
+      </w:pPr>
+      <w:r>
+        <w:rPr>
+          <w:b/>
+          <w:bCs/>
+        </w:rPr>
+        <w:t xml:space="preserve">What stands from the original validation.</w:t>
+      </w:r>
+    </w:p>
+    <w:p>
+      <w:pPr>
+        <w:pStyle w:val="Compact"/>
+        <w:numPr>
+          <w:ilvl w:val="0"/>
+          <w:numId w:val="1009"/>
+        </w:numPr>
+      </w:pPr>
+      <w:r>
+        <w:t xml:space="preserve">The M-DIAG-A1 numerator-side fix (the</w:t>
+      </w:r>
+      <w:r>
+        <w:t xml:space="preserve"> </w:t>
+      </w:r>
+      <w:r>
+        <w:rPr>
+          <w:rStyle w:val="VerbatimChar"/>
+        </w:rPr>
+        <w:t xml:space="preserve">mean_key</w:t>
+      </w:r>
+      <w:r>
+        <w:t xml:space="preserve"> </w:t>
+      </w:r>
+      <w:r>
+        <w:t xml:space="preserve">bug at</w:t>
+      </w:r>
+      <w:r>
+        <w:t xml:space="preserve"> </w:t>
+      </w:r>
+      <w:r>
+        <w:rPr>
+          <w:rStyle w:val="VerbatimChar"/>
+        </w:rPr>
+        <w:t xml:space="preserve">_server_side_hf</w:t>
+      </w:r>
+      <w:r>
+        <w:t xml:space="preserve">) was necessary and remains correct.</w:t>
+      </w:r>
+    </w:p>
+    <w:p>
+      <w:pPr>
+        <w:pStyle w:val="Compact"/>
+        <w:numPr>
+          <w:ilvl w:val="0"/>
+          <w:numId w:val="1009"/>
+        </w:numPr>
+      </w:pPr>
+      <w:r>
+        <w:t xml:space="preserve">The aggregate z’s failure to detect Dakar dust events (-3.39) reflects that regional dust events affect the whole region uniformly, leaving no local contrast. Under the attributability framing this is</w:t>
+      </w:r>
+      <w:r>
+        <w:t xml:space="preserve"> </w:t>
+      </w:r>
+      <w:r>
+        <w:rPr>
+          <w:b/>
+          <w:bCs/>
+        </w:rPr>
+        <w:t xml:space="preserve">correct</w:t>
+      </w:r>
+      <w:r>
+        <w:t xml:space="preserve"> </w:t>
+      </w:r>
+      <w:r>
+        <w:t xml:space="preserve">behaviour — the supplier was not the source of the regional dust storm. (§10’s residual caveat documents the same mechanism for the Quebec event.)</w:t>
+      </w:r>
+    </w:p>
+    <w:p>
+      <w:pPr>
+        <w:pStyle w:val="Compact"/>
+        <w:numPr>
+          <w:ilvl w:val="0"/>
+          <w:numId w:val="1009"/>
+        </w:numPr>
+      </w:pPr>
+      <w:r>
+        <w:t xml:space="preserve">M-DIAG-A4 v2.0’s climatology-baseline denominator fix corrects a real numerical scale error in the per-day z denominator (the spatial std of the time-averaged field was the wrong scale); the fix is justified on numerical-correctness grounds independent of any framing interpretation. §10 quantifies this (the 9.7× / 45.7× / 4.3× spatial-vs-temporal denominator ratios).</w:t>
+      </w:r>
+    </w:p>
+    <w:p>
+      <w:pPr>
+        <w:pStyle w:val="FirstParagraph"/>
+      </w:pPr>
+      <w:r>
+        <w:rPr>
+          <w:b/>
+          <w:bCs/>
+        </w:rPr>
+        <w:t xml:space="preserve">What changed in interpretation.</w:t>
+      </w:r>
+    </w:p>
+    <w:p>
+      <w:pPr>
+        <w:pStyle w:val="Compact"/>
+        <w:numPr>
+          <w:ilvl w:val="0"/>
+          <w:numId w:val="1010"/>
+        </w:numPr>
+      </w:pPr>
+      <w:r>
+        <w:t xml:space="preserve">The</w:t>
+      </w:r>
+      <w:r>
+        <w:t xml:space="preserve"> </w:t>
+      </w:r>
+      <w:r>
+        <w:t xml:space="preserve">“5/5 false-positive rate”</w:t>
+      </w:r>
+      <w:r>
+        <w:t xml:space="preserve"> </w:t>
+      </w:r>
+      <w:r>
+        <w:t xml:space="preserve">framing was over-broad — some firings were correct attributability behaviour, others were magnitude artefacts of the denominator collapse. The two should not be pooled into a single</w:t>
+      </w:r>
+      <w:r>
+        <w:t xml:space="preserve"> </w:t>
+      </w:r>
+      <w:r>
+        <w:t xml:space="preserve">“false-positive”</w:t>
+      </w:r>
+      <w:r>
+        <w:t xml:space="preserve"> </w:t>
+      </w:r>
+      <w:r>
+        <w:t xml:space="preserve">count.</w:t>
+      </w:r>
+    </w:p>
+    <w:p>
+      <w:pPr>
+        <w:pStyle w:val="Compact"/>
+        <w:numPr>
+          <w:ilvl w:val="0"/>
+          <w:numId w:val="1010"/>
+        </w:numPr>
+      </w:pPr>
+      <w:r>
+        <w:t xml:space="preserve">The</w:t>
+      </w:r>
+      <w:r>
+        <w:t xml:space="preserve"> </w:t>
+      </w:r>
+      <w:r>
+        <w:t xml:space="preserve">“aggregate z fails to detect real events”</w:t>
+      </w:r>
+      <w:r>
+        <w:t xml:space="preserve"> </w:t>
+      </w:r>
+      <w:r>
+        <w:t xml:space="preserve">framing was framing-sensitive — regional events are correctly invisible to an attributability detector when no local contrast exists.</w:t>
+      </w:r>
+    </w:p>
+    <w:p>
+      <w:pPr>
+        <w:pStyle w:val="Compact"/>
+        <w:numPr>
+          <w:ilvl w:val="0"/>
+          <w:numId w:val="1010"/>
+        </w:numPr>
+      </w:pPr>
+      <w:r>
+        <w:t xml:space="preserve">The fix recommendation (climatology baseline) stands on numerical grounds; the event-detection improvement was incidental to the justification, not its basis.</w:t>
+      </w:r>
+    </w:p>
+    <w:p>
+      <w:pPr>
+        <w:pStyle w:val="FirstParagraph"/>
+      </w:pPr>
+      <w:r>
+        <w:rPr>
+          <w:b/>
+          <w:bCs/>
+        </w:rPr>
+        <w:t xml:space="preserve">Reference.</w:t>
+      </w:r>
+      <w:r>
+        <w:t xml:space="preserve"> </w:t>
+      </w:r>
+      <w:r>
+        <w:t xml:space="preserve">This addendum brings the validation into alignment with the attributability framing canonically established in</w:t>
+      </w:r>
+      <w:r>
+        <w:t xml:space="preserve"> </w:t>
+      </w:r>
+      <w:r>
+        <w:rPr>
+          <w:rStyle w:val="VerbatimChar"/>
+        </w:rPr>
+        <w:t xml:space="preserve">Indicators_Computation_v4.md</w:t>
+      </w:r>
+      <w:r>
+        <w:t xml:space="preserve"> </w:t>
+      </w:r>
+      <w:r>
+        <w:t xml:space="preserve">§0.7. The layering is deliberate: §10 (M-DIAG-A4) covers the</w:t>
+      </w:r>
+      <w:r>
+        <w:t xml:space="preserve"> </w:t>
+      </w:r>
+      <w:r>
+        <w:rPr>
+          <w:b/>
+          <w:bCs/>
+        </w:rPr>
+        <w:t xml:space="preserve">numerical</w:t>
+      </w:r>
+      <w:r>
+        <w:t xml:space="preserve"> </w:t>
+      </w:r>
+      <w:r>
+        <w:t xml:space="preserve">re-validation under the new denominator; the M-DIAG-A3 diagnosis addendum (shipped under M-DIAG-A4) covers the same framing reread at the</w:t>
+      </w:r>
+      <w:r>
+        <w:t xml:space="preserve"> </w:t>
+      </w:r>
+      <w:r>
+        <w:rPr>
+          <w:b/>
+          <w:bCs/>
+        </w:rPr>
+        <w:t xml:space="preserve">diagnostic</w:t>
+      </w:r>
+      <w:r>
+        <w:t xml:space="preserve"> </w:t>
+      </w:r>
+      <w:r>
+        <w:t xml:space="preserve">level; this §11 covers the</w:t>
+      </w:r>
+      <w:r>
+        <w:t xml:space="preserve"> </w:t>
+      </w:r>
+      <w:r>
+        <w:rPr>
+          <w:b/>
+          <w:bCs/>
+        </w:rPr>
+        <w:t xml:space="preserve">framing</w:t>
+      </w:r>
+      <w:r>
+        <w:t xml:space="preserve"> </w:t>
+      </w:r>
+      <w:r>
+        <w:t xml:space="preserve">reframe of the validation report’s headline narrative. The three are related layers of one reread, not orthogonal claims.</w:t>
+      </w:r>
+    </w:p>
+    <w:p>
+      <w:pPr>
+        <w:pStyle w:val="BodyText"/>
+      </w:pPr>
+      <w:r>
+        <w:rPr>
+          <w:i/>
+          <w:iCs/>
+        </w:rPr>
+        <w:t xml:space="preserve">Addendum deliverable: this §11. Word re-export at</w:t>
+      </w:r>
+      <w:r>
+        <w:rPr>
+          <w:i/>
+          <w:iCs/>
+        </w:rPr>
+        <w:t xml:space="preserve"> </w:t>
+      </w:r>
+      <w:r>
+        <w:rPr>
+          <w:rStyle w:val="VerbatimChar"/>
+          <w:i/>
+          <w:iCs/>
+        </w:rPr>
+        <w:t xml:space="preserve">docs/aai_firms_validation.docx</w:t>
+      </w:r>
+      <w:r>
+        <w:rPr>
+          <w:i/>
+          <w:iCs/>
+        </w:rPr>
+        <w:t xml:space="preserve"> </w:t>
+      </w:r>
+      <w:r>
+        <w:rPr>
+          <w:i/>
+          <w:iCs/>
+        </w:rPr>
+        <w:t xml:space="preserve">(Step C3).</w:t>
+      </w:r>
+    </w:p>
+    <w:bookmarkEnd w:id="33"/>
+    <w:bookmarkEnd w:id="34"/>
     <w:sectPr>
       <w:footnotePr>
         <w:numRestart w:val="eachSect"/>
@@ -5658,6 +6897,45 @@
     <w:lvlOverride w:ilvl="8">
       <w:startOverride w:val="1"/>
     </w:lvlOverride>
+  </w:num>
+  <w:num w:numId="1007">
+    <w:abstractNumId w:val="991"/>
+  </w:num>
+  <w:num w:numId="1008">
+    <w:abstractNumId w:val="99411"/>
+    <w:lvlOverride w:ilvl="0">
+      <w:startOverride w:val="1"/>
+    </w:lvlOverride>
+    <w:lvlOverride w:ilvl="1">
+      <w:startOverride w:val="1"/>
+    </w:lvlOverride>
+    <w:lvlOverride w:ilvl="2">
+      <w:startOverride w:val="1"/>
+    </w:lvlOverride>
+    <w:lvlOverride w:ilvl="3">
+      <w:startOverride w:val="1"/>
+    </w:lvlOverride>
+    <w:lvlOverride w:ilvl="4">
+      <w:startOverride w:val="1"/>
+    </w:lvlOverride>
+    <w:lvlOverride w:ilvl="5">
+      <w:startOverride w:val="1"/>
+    </w:lvlOverride>
+    <w:lvlOverride w:ilvl="6">
+      <w:startOverride w:val="1"/>
+    </w:lvlOverride>
+    <w:lvlOverride w:ilvl="7">
+      <w:startOverride w:val="1"/>
+    </w:lvlOverride>
+    <w:lvlOverride w:ilvl="8">
+      <w:startOverride w:val="1"/>
+    </w:lvlOverride>
+  </w:num>
+  <w:num w:numId="1009">
+    <w:abstractNumId w:val="991"/>
+  </w:num>
+  <w:num w:numId="1010">
+    <w:abstractNumId w:val="991"/>
   </w:num>
 </w:numbering>
 </file>

</xml_diff>